<commit_message>
Ajustes varios - caja
</commit_message>
<xml_diff>
--- a/Reportes/poliza_fraude.docx
+++ b/Reportes/poliza_fraude.docx
@@ -1632,9 +1632,9 @@
         <w:tblLook w:val="04A0" w:firstRow="1" w:lastRow="0" w:firstColumn="1" w:lastColumn="0" w:noHBand="0" w:noVBand="1"/>
       </w:tblPr>
       <w:tblGrid>
-        <w:gridCol w:w="5920"/>
-        <w:gridCol w:w="2410"/>
-        <w:gridCol w:w="1559"/>
+        <w:gridCol w:w="5608"/>
+        <w:gridCol w:w="2970"/>
+        <w:gridCol w:w="1311"/>
         <w:gridCol w:w="1435"/>
       </w:tblGrid>
       <w:tr>
@@ -1643,7 +1643,7 @@
         </w:trPr>
         <w:tc>
           <w:tcPr>
-            <w:tcW w:w="5920" w:type="dxa"/>
+            <w:tcW w:w="5608" w:type="dxa"/>
             <w:tcBorders>
               <w:bottom w:val="single" w:sz="8" w:space="0" w:color="auto"/>
             </w:tcBorders>
@@ -1672,7 +1672,7 @@
         </w:tc>
         <w:tc>
           <w:tcPr>
-            <w:tcW w:w="2410" w:type="dxa"/>
+            <w:tcW w:w="2970" w:type="dxa"/>
             <w:tcBorders>
               <w:bottom w:val="single" w:sz="8" w:space="0" w:color="auto"/>
             </w:tcBorders>
@@ -1681,6 +1681,7 @@
             <w:pPr>
               <w:pStyle w:val="Textoindependiente"/>
               <w:spacing w:before="3"/>
+              <w:jc w:val="center"/>
               <w:rPr>
                 <w:sz w:val="15"/>
                 <w:szCs w:val="15"/>
@@ -1700,7 +1701,7 @@
         </w:tc>
         <w:tc>
           <w:tcPr>
-            <w:tcW w:w="1559" w:type="dxa"/>
+            <w:tcW w:w="1311" w:type="dxa"/>
             <w:tcBorders>
               <w:bottom w:val="single" w:sz="8" w:space="0" w:color="auto"/>
             </w:tcBorders>
@@ -1709,6 +1710,7 @@
             <w:pPr>
               <w:pStyle w:val="Textoindependiente"/>
               <w:spacing w:before="3"/>
+              <w:jc w:val="center"/>
               <w:rPr>
                 <w:sz w:val="15"/>
                 <w:szCs w:val="15"/>
@@ -1737,6 +1739,7 @@
             <w:pPr>
               <w:pStyle w:val="Textoindependiente"/>
               <w:spacing w:before="3"/>
+              <w:jc w:val="center"/>
               <w:rPr>
                 <w:sz w:val="15"/>
                 <w:szCs w:val="15"/>
@@ -1761,7 +1764,7 @@
         </w:trPr>
         <w:tc>
           <w:tcPr>
-            <w:tcW w:w="5920" w:type="dxa"/>
+            <w:tcW w:w="5608" w:type="dxa"/>
             <w:tcBorders>
               <w:left w:val="nil"/>
               <w:right w:val="nil"/>
@@ -1817,7 +1820,7 @@
         </w:tc>
         <w:tc>
           <w:tcPr>
-            <w:tcW w:w="2410" w:type="dxa"/>
+            <w:tcW w:w="2970" w:type="dxa"/>
             <w:tcBorders>
               <w:left w:val="nil"/>
               <w:right w:val="nil"/>
@@ -1852,7 +1855,7 @@
         </w:tc>
         <w:tc>
           <w:tcPr>
-            <w:tcW w:w="1559" w:type="dxa"/>
+            <w:tcW w:w="1311" w:type="dxa"/>
             <w:tcBorders>
               <w:left w:val="nil"/>
               <w:right w:val="nil"/>

</xml_diff>